<commit_message>
chore: 重新生成 v1.4 PDF + Word（同步 .md 最新内容）
Co-authored-by: Cursor <cursoragent@cursor.com>
</commit_message>
<xml_diff>
--- a/restart/重启_双战斗体系_系统策划案_v1.4.docx
+++ b/restart/重启_双战斗体系_系统策划案_v1.4.docx
@@ -1132,7 +1132,25 @@
                 <w:i w:val="0"/>
                 <w:sz w:val="21"/>
               </w:rPr>
-              <w:t>希恩按怀表；玩家可按 R 强制回合制（希恩必须在队伍中）</w:t>
+              <w:t>希恩按怀表；玩家可按 R 强制回合制（</w:t>
+            </w:r>
+            <w:r>
+              <w:rPr>
+                <w:rFonts w:ascii="Times New Roman" w:hAnsi="Times New Roman" w:eastAsia="宋体"/>
+                <w:b/>
+                <w:i w:val="0"/>
+                <w:sz w:val="21"/>
+              </w:rPr>
+              <w:t>野外 / Boss 都可</w:t>
+            </w:r>
+            <w:r>
+              <w:rPr>
+                <w:rFonts w:ascii="Times New Roman" w:hAnsi="Times New Roman" w:eastAsia="宋体"/>
+                <w:b w:val="0"/>
+                <w:i w:val="0"/>
+                <w:sz w:val="21"/>
+              </w:rPr>
+              <w:t>，希恩必须在队伍中）</w:t>
             </w:r>
           </w:p>
         </w:tc>
@@ -1205,6 +1223,150 @@
                 <w:sz w:val="21"/>
               </w:rPr>
               <w:t>L1 通用键位 + L3 每个角色独特战斗风格</w:t>
+            </w:r>
+          </w:p>
+        </w:tc>
+      </w:tr>
+      <w:tr>
+        <w:tc>
+          <w:tcPr>
+            <w:tcW w:type="dxa" w:w="4320"/>
+          </w:tcPr>
+          <w:p>
+            <w:r/>
+            <w:r>
+              <w:rPr>
+                <w:rFonts w:ascii="Times New Roman" w:hAnsi="Times New Roman" w:eastAsia="宋体"/>
+                <w:b/>
+                <w:i w:val="0"/>
+                <w:sz w:val="21"/>
+              </w:rPr>
+              <w:t>招式同一性（v1.4）</w:t>
+            </w:r>
+          </w:p>
+        </w:tc>
+        <w:tc>
+          <w:tcPr>
+            <w:tcW w:type="dxa" w:w="4320"/>
+          </w:tcPr>
+          <w:p>
+            <w:r/>
+            <w:r>
+              <w:rPr>
+                <w:rFonts w:ascii="Times New Roman" w:hAnsi="Times New Roman" w:eastAsia="宋体"/>
+                <w:b w:val="0"/>
+                <w:i w:val="0"/>
+                <w:sz w:val="21"/>
+              </w:rPr>
+              <w:t xml:space="preserve">即时招式 ↔ 回合制指令 = </w:t>
+            </w:r>
+            <w:r>
+              <w:rPr>
+                <w:rFonts w:ascii="Times New Roman" w:hAnsi="Times New Roman" w:eastAsia="宋体"/>
+                <w:b/>
+                <w:i w:val="0"/>
+                <w:sz w:val="21"/>
+              </w:rPr>
+              <w:t>同一招</w:t>
+            </w:r>
+            <w:r>
+              <w:rPr>
+                <w:rFonts w:ascii="Times New Roman" w:hAnsi="Times New Roman" w:eastAsia="宋体"/>
+                <w:b w:val="0"/>
+                <w:i w:val="0"/>
+                <w:sz w:val="21"/>
+              </w:rPr>
+              <w:t>（同名 / 同动画）—— 详见 §3.1.1</w:t>
+            </w:r>
+          </w:p>
+        </w:tc>
+      </w:tr>
+      <w:tr>
+        <w:tc>
+          <w:tcPr>
+            <w:tcW w:type="dxa" w:w="4320"/>
+          </w:tcPr>
+          <w:p>
+            <w:r/>
+            <w:r>
+              <w:rPr>
+                <w:rFonts w:ascii="Times New Roman" w:hAnsi="Times New Roman" w:eastAsia="宋体"/>
+                <w:b/>
+                <w:i w:val="0"/>
+                <w:sz w:val="21"/>
+              </w:rPr>
+              <w:t>数值分离（v1.4）</w:t>
+            </w:r>
+          </w:p>
+        </w:tc>
+        <w:tc>
+          <w:tcPr>
+            <w:tcW w:type="dxa" w:w="4320"/>
+          </w:tcPr>
+          <w:p>
+            <w:r/>
+            <w:r>
+              <w:rPr>
+                <w:rFonts w:ascii="Times New Roman" w:hAnsi="Times New Roman" w:eastAsia="宋体"/>
+                <w:b w:val="0"/>
+                <w:i w:val="0"/>
+                <w:sz w:val="21"/>
+              </w:rPr>
+              <w:t>同一招在两模式下走</w:t>
+            </w:r>
+            <w:r>
+              <w:rPr>
+                <w:rFonts w:ascii="Times New Roman" w:hAnsi="Times New Roman" w:eastAsia="宋体"/>
+                <w:b/>
+                <w:i w:val="0"/>
+                <w:sz w:val="21"/>
+              </w:rPr>
+              <w:t>不同伤害公式</w:t>
+            </w:r>
+            <w:r>
+              <w:rPr>
+                <w:rFonts w:ascii="Times New Roman" w:hAnsi="Times New Roman" w:eastAsia="宋体"/>
+                <w:b w:val="0"/>
+                <w:i w:val="0"/>
+                <w:sz w:val="21"/>
+              </w:rPr>
+              <w:t>；回合制多 7 个参数 → 高血量 BOSS 比即时快 20%—— 详见 §3.1.2</w:t>
+            </w:r>
+          </w:p>
+        </w:tc>
+      </w:tr>
+      <w:tr>
+        <w:tc>
+          <w:tcPr>
+            <w:tcW w:type="dxa" w:w="4320"/>
+          </w:tcPr>
+          <w:p>
+            <w:r/>
+            <w:r>
+              <w:rPr>
+                <w:rFonts w:ascii="Times New Roman" w:hAnsi="Times New Roman" w:eastAsia="宋体"/>
+                <w:b/>
+                <w:i w:val="0"/>
+                <w:sz w:val="21"/>
+              </w:rPr>
+              <w:t>模式使用规则（v1.4）</w:t>
+            </w:r>
+          </w:p>
+        </w:tc>
+        <w:tc>
+          <w:tcPr>
+            <w:tcW w:type="dxa" w:w="4320"/>
+          </w:tcPr>
+          <w:p>
+            <w:r/>
+            <w:r>
+              <w:rPr>
+                <w:rFonts w:ascii="Times New Roman" w:hAnsi="Times New Roman" w:eastAsia="宋体"/>
+                <w:b w:val="0"/>
+                <w:i w:val="0"/>
+                <w:sz w:val="21"/>
+              </w:rPr>
+              <w:t>野外不限制；部分 BOSS 强制即时；部分 BOSS 强制回合—— 详见 §3.1</w:t>
             </w:r>
           </w:p>
         </w:tc>
@@ -3781,11 +3943,11 @@
             <w:r>
               <w:rPr>
                 <w:rFonts w:ascii="Times New Roman" w:hAnsi="Times New Roman" w:eastAsia="宋体"/>
-                <w:b w:val="0"/>
-                <w:i w:val="0"/>
-                <w:sz w:val="21"/>
-              </w:rPr>
-              <w:t>强制回合制（随时）</w:t>
+                <w:b/>
+                <w:i w:val="0"/>
+                <w:sz w:val="21"/>
+              </w:rPr>
+              <w:t>野外 / Boss 都可强制回合制（随时）</w:t>
             </w:r>
           </w:p>
         </w:tc>
@@ -3971,6 +4133,121 @@
           <w:sz w:val="21"/>
         </w:rPr>
         <w:t>野外用即时 → 不刷级的流畅体验。Boss 用回合制 → Boss 难，需要策略。</w:t>
+      </w:r>
+    </w:p>
+    <w:p>
+      <w:r>
+        <w:rPr>
+          <w:rFonts w:ascii="Times New Roman" w:hAnsi="Times New Roman" w:eastAsia="宋体"/>
+          <w:b/>
+          <w:i w:val="0"/>
+          <w:sz w:val="21"/>
+        </w:rPr>
+        <w:t>R 键野外也能用</w:t>
+      </w:r>
+      <w:r>
+        <w:rPr>
+          <w:rFonts w:ascii="Times New Roman" w:hAnsi="Times New Roman" w:eastAsia="宋体"/>
+          <w:b w:val="0"/>
+          <w:i w:val="0"/>
+          <w:sz w:val="21"/>
+        </w:rPr>
+        <w:t>：野外不限制玩家自由使用两种模式——玩家随时可按 R 把当前野外战斗切到回合制。这给玩家提供了「在野外慢下来」的选项——比如遇到精英怪、或需要策略而非手感时。约束仍生效：希恩缺席 = R 键失效；后期（真结局前）= R 键禁用。</w:t>
+      </w:r>
+    </w:p>
+    <w:p>
+      <w:r>
+        <w:rPr>
+          <w:rFonts w:ascii="Times New Roman" w:hAnsi="Times New Roman" w:eastAsia="宋体"/>
+          <w:b/>
+          <w:i w:val="0"/>
+          <w:sz w:val="21"/>
+        </w:rPr>
+        <w:t>模式使用规则（v1.4 补充）</w:t>
+      </w:r>
+      <w:r>
+        <w:rPr>
+          <w:rFonts w:ascii="Times New Roman" w:hAnsi="Times New Roman" w:eastAsia="宋体"/>
+          <w:b w:val="0"/>
+          <w:i w:val="0"/>
+          <w:sz w:val="21"/>
+        </w:rPr>
+        <w:t>：</w:t>
+      </w:r>
+    </w:p>
+    <w:p>
+      <w:pPr>
+        <w:pStyle w:val="ListBullet"/>
+      </w:pPr>
+      <w:r>
+        <w:rPr>
+          <w:rFonts w:ascii="Times New Roman" w:hAnsi="Times New Roman" w:eastAsia="宋体"/>
+          <w:b w:val="0"/>
+          <w:i w:val="0"/>
+          <w:sz w:val="21"/>
+        </w:rPr>
+        <w:t>野外：不限制——玩家自由切换即时 / 回合制</w:t>
+      </w:r>
+    </w:p>
+    <w:p>
+      <w:pPr>
+        <w:pStyle w:val="ListBullet"/>
+      </w:pPr>
+      <w:r>
+        <w:rPr>
+          <w:rFonts w:ascii="Times New Roman" w:hAnsi="Times New Roman" w:eastAsia="宋体"/>
+          <w:b w:val="0"/>
+          <w:i w:val="0"/>
+          <w:sz w:val="21"/>
+        </w:rPr>
+        <w:t>部分 BOSS 关卡：强制即时</w:t>
+      </w:r>
+    </w:p>
+    <w:p>
+      <w:pPr>
+        <w:pStyle w:val="ListBullet"/>
+      </w:pPr>
+      <w:r>
+        <w:rPr>
+          <w:rFonts w:ascii="Times New Roman" w:hAnsi="Times New Roman" w:eastAsia="宋体"/>
+          <w:b w:val="0"/>
+          <w:i w:val="0"/>
+          <w:sz w:val="21"/>
+        </w:rPr>
+        <w:t>部分 BOSS 关卡：强制回合</w:t>
+      </w:r>
+    </w:p>
+    <w:p>
+      <w:pPr>
+        <w:pStyle w:val="ListBullet"/>
+      </w:pPr>
+      <w:r>
+        <w:rPr>
+          <w:rFonts w:ascii="Times New Roman" w:hAnsi="Times New Roman" w:eastAsia="宋体"/>
+          <w:b w:val="0"/>
+          <w:i w:val="0"/>
+          <w:sz w:val="21"/>
+        </w:rPr>
+        <w:t xml:space="preserve">强制模式在关卡脚本中配置（Boss 标签携带 </w:t>
+      </w:r>
+      <w:r>
+        <w:rPr>
+          <w:rFonts w:ascii="Courier New" w:hAnsi="Courier New" w:eastAsia="宋体"/>
+          <w:b w:val="0"/>
+          <w:i w:val="0"/>
+          <w:color w:val="888888"/>
+          <w:sz w:val="21"/>
+        </w:rPr>
+        <w:t>mode_required</w:t>
+      </w:r>
+      <w:r>
+        <w:rPr>
+          <w:rFonts w:ascii="Times New Roman" w:hAnsi="Times New Roman" w:eastAsia="宋体"/>
+          <w:b w:val="0"/>
+          <w:i w:val="0"/>
+          <w:sz w:val="21"/>
+        </w:rPr>
+        <w:t xml:space="preserve"> 字段）</w:t>
       </w:r>
     </w:p>
     <w:p>
@@ -4103,6 +4380,1903 @@
           <w:i w:val="0"/>
           <w:sz w:val="21"/>
         </w:rPr>
+        <w:t>3.1.1 双战斗招式同一性原则（v1.4 新增——核心设计）</w:t>
+      </w:r>
+    </w:p>
+    <w:p>
+      <w:r>
+        <w:rPr>
+          <w:rFonts w:ascii="Times New Roman" w:hAnsi="Times New Roman" w:eastAsia="宋体"/>
+          <w:b/>
+          <w:i w:val="0"/>
+          <w:sz w:val="21"/>
+        </w:rPr>
+        <w:t>这是整个双战斗体系的叙事根基</w:t>
+      </w:r>
+      <w:r>
+        <w:rPr>
+          <w:rFonts w:ascii="Times New Roman" w:hAnsi="Times New Roman" w:eastAsia="宋体"/>
+          <w:b w:val="0"/>
+          <w:i w:val="0"/>
+          <w:sz w:val="21"/>
+        </w:rPr>
+        <w:t>。空轨的问题是：即时战斗技能与回合制战技是</w:t>
+      </w:r>
+      <w:r>
+        <w:rPr>
+          <w:rFonts w:ascii="Times New Roman" w:hAnsi="Times New Roman" w:eastAsia="宋体"/>
+          <w:b/>
+          <w:i w:val="0"/>
+          <w:sz w:val="21"/>
+        </w:rPr>
+        <w:t>两套系统</w:t>
+      </w:r>
+      <w:r>
+        <w:rPr>
+          <w:rFonts w:ascii="Times New Roman" w:hAnsi="Times New Roman" w:eastAsia="宋体"/>
+          <w:b w:val="0"/>
+          <w:i w:val="0"/>
+          <w:sz w:val="21"/>
+        </w:rPr>
+        <w:t>——没有招式定位相似、名称相同、效果类似。这导致玩家觉得两个模式是两个游戏——</w:t>
+      </w:r>
+      <w:r>
+        <w:rPr>
+          <w:rFonts w:ascii="Times New Roman" w:hAnsi="Times New Roman" w:eastAsia="宋体"/>
+          <w:b/>
+          <w:i w:val="0"/>
+          <w:sz w:val="21"/>
+        </w:rPr>
+        <w:t>叙事割裂</w:t>
+      </w:r>
+      <w:r>
+        <w:rPr>
+          <w:rFonts w:ascii="Times New Roman" w:hAnsi="Times New Roman" w:eastAsia="宋体"/>
+          <w:b w:val="0"/>
+          <w:i w:val="0"/>
+          <w:sz w:val="21"/>
+        </w:rPr>
+        <w:t>。</w:t>
+      </w:r>
+    </w:p>
+    <w:p>
+      <w:r>
+        <w:rPr>
+          <w:rFonts w:ascii="Times New Roman" w:hAnsi="Times New Roman" w:eastAsia="宋体"/>
+          <w:b w:val="0"/>
+          <w:i w:val="0"/>
+          <w:sz w:val="21"/>
+        </w:rPr>
+        <w:t>本作的解法：</w:t>
+      </w:r>
+    </w:p>
+    <w:tbl>
+      <w:tblPr>
+        <w:tblStyle w:val="LightGrid-Accent1"/>
+        <w:tblW w:type="auto" w:w="0"/>
+        <w:tblLook w:firstColumn="1" w:firstRow="1" w:lastColumn="0" w:lastRow="0" w:noHBand="0" w:noVBand="1" w:val="04A0"/>
+      </w:tblPr>
+      <w:tblGrid>
+        <w:gridCol w:w="2880"/>
+        <w:gridCol w:w="2880"/>
+        <w:gridCol w:w="2880"/>
+      </w:tblGrid>
+      <w:tr>
+        <w:tc>
+          <w:tcPr>
+            <w:tcW w:type="dxa" w:w="2880"/>
+          </w:tcPr>
+          <w:p>
+            <w:r/>
+            <w:r>
+              <w:rPr>
+                <w:rFonts w:ascii="Times New Roman" w:hAnsi="Times New Roman" w:eastAsia="宋体"/>
+                <w:b w:val="0"/>
+                <w:i w:val="0"/>
+                <w:sz w:val="21"/>
+              </w:rPr>
+              <w:t>维度</w:t>
+            </w:r>
+          </w:p>
+        </w:tc>
+        <w:tc>
+          <w:tcPr>
+            <w:tcW w:type="dxa" w:w="2880"/>
+          </w:tcPr>
+          <w:p>
+            <w:r/>
+            <w:r>
+              <w:rPr>
+                <w:rFonts w:ascii="Times New Roman" w:hAnsi="Times New Roman" w:eastAsia="宋体"/>
+                <w:b w:val="0"/>
+                <w:i w:val="0"/>
+                <w:sz w:val="21"/>
+              </w:rPr>
+              <w:t>即时战斗</w:t>
+            </w:r>
+          </w:p>
+        </w:tc>
+        <w:tc>
+          <w:tcPr>
+            <w:tcW w:type="dxa" w:w="2880"/>
+          </w:tcPr>
+          <w:p>
+            <w:r/>
+            <w:r>
+              <w:rPr>
+                <w:rFonts w:ascii="Times New Roman" w:hAnsi="Times New Roman" w:eastAsia="宋体"/>
+                <w:b w:val="0"/>
+                <w:i w:val="0"/>
+                <w:sz w:val="21"/>
+              </w:rPr>
+              <w:t>回合制</w:t>
+            </w:r>
+          </w:p>
+        </w:tc>
+      </w:tr>
+      <w:tr>
+        <w:tc>
+          <w:tcPr>
+            <w:tcW w:type="dxa" w:w="2880"/>
+          </w:tcPr>
+          <w:p>
+            <w:r/>
+            <w:r>
+              <w:rPr>
+                <w:rFonts w:ascii="Times New Roman" w:hAnsi="Times New Roman" w:eastAsia="宋体"/>
+                <w:b w:val="0"/>
+                <w:i w:val="0"/>
+                <w:sz w:val="21"/>
+              </w:rPr>
+              <w:t>输入</w:t>
+            </w:r>
+          </w:p>
+        </w:tc>
+        <w:tc>
+          <w:tcPr>
+            <w:tcW w:type="dxa" w:w="2880"/>
+          </w:tcPr>
+          <w:p>
+            <w:r/>
+            <w:r>
+              <w:rPr>
+                <w:rFonts w:ascii="Times New Roman" w:hAnsi="Times New Roman" w:eastAsia="宋体"/>
+                <w:b w:val="0"/>
+                <w:i w:val="0"/>
+                <w:sz w:val="21"/>
+              </w:rPr>
+              <w:t>按键组合（例：w+s+长按 j）</w:t>
+            </w:r>
+          </w:p>
+        </w:tc>
+        <w:tc>
+          <w:tcPr>
+            <w:tcW w:type="dxa" w:w="2880"/>
+          </w:tcPr>
+          <w:p>
+            <w:r/>
+            <w:r>
+              <w:rPr>
+                <w:rFonts w:ascii="Times New Roman" w:hAnsi="Times New Roman" w:eastAsia="宋体"/>
+                <w:b w:val="0"/>
+                <w:i w:val="0"/>
+                <w:sz w:val="21"/>
+              </w:rPr>
+              <w:t>指令菜单选战技</w:t>
+            </w:r>
+          </w:p>
+        </w:tc>
+      </w:tr>
+      <w:tr>
+        <w:tc>
+          <w:tcPr>
+            <w:tcW w:type="dxa" w:w="2880"/>
+          </w:tcPr>
+          <w:p>
+            <w:r/>
+            <w:r>
+              <w:rPr>
+                <w:rFonts w:ascii="Times New Roman" w:hAnsi="Times New Roman" w:eastAsia="宋体"/>
+                <w:b w:val="0"/>
+                <w:i w:val="0"/>
+                <w:sz w:val="21"/>
+              </w:rPr>
+              <w:t>招式名</w:t>
+            </w:r>
+          </w:p>
+        </w:tc>
+        <w:tc>
+          <w:tcPr>
+            <w:tcW w:type="dxa" w:w="2880"/>
+          </w:tcPr>
+          <w:p>
+            <w:r/>
+            <w:r>
+              <w:rPr>
+                <w:rFonts w:ascii="Times New Roman" w:hAnsi="Times New Roman" w:eastAsia="宋体"/>
+                <w:b w:val="0"/>
+                <w:i w:val="0"/>
+                <w:sz w:val="21"/>
+              </w:rPr>
+              <w:t>【猎空斩】</w:t>
+            </w:r>
+          </w:p>
+        </w:tc>
+        <w:tc>
+          <w:tcPr>
+            <w:tcW w:type="dxa" w:w="2880"/>
+          </w:tcPr>
+          <w:p>
+            <w:r/>
+            <w:r>
+              <w:rPr>
+                <w:rFonts w:ascii="Times New Roman" w:hAnsi="Times New Roman" w:eastAsia="宋体"/>
+                <w:b/>
+                <w:i w:val="0"/>
+                <w:sz w:val="21"/>
+              </w:rPr>
+              <w:t>【猎空斩】</w:t>
+            </w:r>
+            <w:r>
+              <w:rPr>
+                <w:rFonts w:ascii="Times New Roman" w:hAnsi="Times New Roman" w:eastAsia="宋体"/>
+                <w:b w:val="0"/>
+                <w:i w:val="0"/>
+                <w:sz w:val="21"/>
+              </w:rPr>
+              <w:t>（</w:t>
+            </w:r>
+            <w:r>
+              <w:rPr>
+                <w:rFonts w:ascii="Times New Roman" w:hAnsi="Times New Roman" w:eastAsia="宋体"/>
+                <w:b/>
+                <w:i w:val="0"/>
+                <w:sz w:val="21"/>
+              </w:rPr>
+              <w:t>完全同名</w:t>
+            </w:r>
+            <w:r>
+              <w:rPr>
+                <w:rFonts w:ascii="Times New Roman" w:hAnsi="Times New Roman" w:eastAsia="宋体"/>
+                <w:b w:val="0"/>
+                <w:i w:val="0"/>
+                <w:sz w:val="21"/>
+              </w:rPr>
+              <w:t>）</w:t>
+            </w:r>
+          </w:p>
+        </w:tc>
+      </w:tr>
+      <w:tr>
+        <w:tc>
+          <w:tcPr>
+            <w:tcW w:type="dxa" w:w="2880"/>
+          </w:tcPr>
+          <w:p>
+            <w:r/>
+            <w:r>
+              <w:rPr>
+                <w:rFonts w:ascii="Times New Roman" w:hAnsi="Times New Roman" w:eastAsia="宋体"/>
+                <w:b w:val="0"/>
+                <w:i w:val="0"/>
+                <w:sz w:val="21"/>
+              </w:rPr>
+              <w:t>动画 / 特效</w:t>
+            </w:r>
+          </w:p>
+        </w:tc>
+        <w:tc>
+          <w:tcPr>
+            <w:tcW w:type="dxa" w:w="2880"/>
+          </w:tcPr>
+          <w:p>
+            <w:r/>
+            <w:r>
+              <w:rPr>
+                <w:rFonts w:ascii="Times New Roman" w:hAnsi="Times New Roman" w:eastAsia="宋体"/>
+                <w:b w:val="0"/>
+                <w:i w:val="0"/>
+                <w:sz w:val="21"/>
+              </w:rPr>
+              <w:t>下劈斩</w:t>
+            </w:r>
+          </w:p>
+        </w:tc>
+        <w:tc>
+          <w:tcPr>
+            <w:tcW w:type="dxa" w:w="2880"/>
+          </w:tcPr>
+          <w:p>
+            <w:r/>
+            <w:r>
+              <w:rPr>
+                <w:rFonts w:ascii="Times New Roman" w:hAnsi="Times New Roman" w:eastAsia="宋体"/>
+                <w:b/>
+                <w:i w:val="0"/>
+                <w:sz w:val="21"/>
+              </w:rPr>
+              <w:t>同一段下劈斩</w:t>
+            </w:r>
+            <w:r>
+              <w:rPr>
+                <w:rFonts w:ascii="Times New Roman" w:hAnsi="Times New Roman" w:eastAsia="宋体"/>
+                <w:b w:val="0"/>
+                <w:i w:val="0"/>
+                <w:sz w:val="21"/>
+              </w:rPr>
+              <w:t>（仅镜头表现不同）</w:t>
+            </w:r>
+          </w:p>
+        </w:tc>
+      </w:tr>
+      <w:tr>
+        <w:tc>
+          <w:tcPr>
+            <w:tcW w:type="dxa" w:w="2880"/>
+          </w:tcPr>
+          <w:p>
+            <w:r/>
+            <w:r>
+              <w:rPr>
+                <w:rFonts w:ascii="Times New Roman" w:hAnsi="Times New Roman" w:eastAsia="宋体"/>
+                <w:b w:val="0"/>
+                <w:i w:val="0"/>
+                <w:sz w:val="21"/>
+              </w:rPr>
+              <w:t>基础伤害机制</w:t>
+            </w:r>
+          </w:p>
+        </w:tc>
+        <w:tc>
+          <w:tcPr>
+            <w:tcW w:type="dxa" w:w="2880"/>
+          </w:tcPr>
+          <w:p>
+            <w:r/>
+            <w:r>
+              <w:rPr>
+                <w:rFonts w:ascii="Times New Roman" w:hAnsi="Times New Roman" w:eastAsia="宋体"/>
+                <w:b w:val="0"/>
+                <w:i w:val="0"/>
+                <w:sz w:val="21"/>
+              </w:rPr>
+              <w:t>同</w:t>
+            </w:r>
+          </w:p>
+        </w:tc>
+        <w:tc>
+          <w:tcPr>
+            <w:tcW w:type="dxa" w:w="2880"/>
+          </w:tcPr>
+          <w:p>
+            <w:r/>
+            <w:r>
+              <w:rPr>
+                <w:rFonts w:ascii="Times New Roman" w:hAnsi="Times New Roman" w:eastAsia="宋体"/>
+                <w:b w:val="0"/>
+                <w:i w:val="0"/>
+                <w:sz w:val="21"/>
+              </w:rPr>
+              <w:t>同</w:t>
+            </w:r>
+          </w:p>
+        </w:tc>
+      </w:tr>
+      <w:tr>
+        <w:tc>
+          <w:tcPr>
+            <w:tcW w:type="dxa" w:w="2880"/>
+          </w:tcPr>
+          <w:p>
+            <w:r/>
+            <w:r>
+              <w:rPr>
+                <w:rFonts w:ascii="Times New Roman" w:hAnsi="Times New Roman" w:eastAsia="宋体"/>
+                <w:b w:val="0"/>
+                <w:i w:val="0"/>
+                <w:sz w:val="21"/>
+              </w:rPr>
+              <w:t>回合制额外</w:t>
+            </w:r>
+          </w:p>
+        </w:tc>
+        <w:tc>
+          <w:tcPr>
+            <w:tcW w:type="dxa" w:w="2880"/>
+          </w:tcPr>
+          <w:p>
+            <w:r/>
+            <w:r>
+              <w:rPr>
+                <w:rFonts w:ascii="Times New Roman" w:hAnsi="Times New Roman" w:eastAsia="宋体"/>
+                <w:b w:val="0"/>
+                <w:i w:val="0"/>
+                <w:sz w:val="21"/>
+              </w:rPr>
+              <w:t>—</w:t>
+            </w:r>
+          </w:p>
+        </w:tc>
+        <w:tc>
+          <w:tcPr>
+            <w:tcW w:type="dxa" w:w="2880"/>
+          </w:tcPr>
+          <w:p>
+            <w:r/>
+            <w:r>
+              <w:rPr>
+                <w:rFonts w:ascii="Times New Roman" w:hAnsi="Times New Roman" w:eastAsia="宋体"/>
+                <w:b w:val="0"/>
+                <w:i w:val="0"/>
+                <w:sz w:val="21"/>
+              </w:rPr>
+              <w:t>由技能设计决定——可能附带 debuff / buff 生效</w:t>
+            </w:r>
+          </w:p>
+        </w:tc>
+      </w:tr>
+    </w:tbl>
+    <w:p/>
+    <w:p>
+      <w:r>
+        <w:rPr>
+          <w:rFonts w:ascii="Times New Roman" w:hAnsi="Times New Roman" w:eastAsia="宋体"/>
+          <w:b/>
+          <w:i w:val="0"/>
+          <w:sz w:val="21"/>
+        </w:rPr>
+        <w:t>R1 同一招式跨模式</w:t>
+      </w:r>
+      <w:r>
+        <w:rPr>
+          <w:rFonts w:ascii="Times New Roman" w:hAnsi="Times New Roman" w:eastAsia="宋体"/>
+          <w:b w:val="0"/>
+          <w:i w:val="0"/>
+          <w:sz w:val="21"/>
+        </w:rPr>
+        <w:t>：即时和回合制里</w:t>
+      </w:r>
+      <w:r>
+        <w:rPr>
+          <w:rFonts w:ascii="Times New Roman" w:hAnsi="Times New Roman" w:eastAsia="宋体"/>
+          <w:b/>
+          <w:i w:val="0"/>
+          <w:sz w:val="21"/>
+        </w:rPr>
+        <w:t>招式是同一个</w:t>
+      </w:r>
+      <w:r>
+        <w:rPr>
+          <w:rFonts w:ascii="Times New Roman" w:hAnsi="Times New Roman" w:eastAsia="宋体"/>
+          <w:b w:val="0"/>
+          <w:i w:val="0"/>
+          <w:sz w:val="21"/>
+        </w:rPr>
+        <w:t>——名字完全相同（例：【猎空斩】两边都叫【猎空斩】，</w:t>
+      </w:r>
+      <w:r>
+        <w:rPr>
+          <w:rFonts w:ascii="Times New Roman" w:hAnsi="Times New Roman" w:eastAsia="宋体"/>
+          <w:b/>
+          <w:i w:val="0"/>
+          <w:sz w:val="21"/>
+        </w:rPr>
+        <w:t>不是即时叫"烈空斩"、回合制叫"裂空斩"</w:t>
+      </w:r>
+      <w:r>
+        <w:rPr>
+          <w:rFonts w:ascii="Times New Roman" w:hAnsi="Times New Roman" w:eastAsia="宋体"/>
+          <w:b w:val="0"/>
+          <w:i w:val="0"/>
+          <w:sz w:val="21"/>
+        </w:rPr>
+        <w:t>）。区别只在</w:t>
+      </w:r>
+      <w:r>
+        <w:rPr>
+          <w:rFonts w:ascii="Times New Roman" w:hAnsi="Times New Roman" w:eastAsia="宋体"/>
+          <w:b/>
+          <w:i w:val="0"/>
+          <w:sz w:val="21"/>
+        </w:rPr>
+        <w:t>数值计算规则</w:t>
+      </w:r>
+      <w:r>
+        <w:rPr>
+          <w:rFonts w:ascii="Times New Roman" w:hAnsi="Times New Roman" w:eastAsia="宋体"/>
+          <w:b w:val="0"/>
+          <w:i w:val="0"/>
+          <w:sz w:val="21"/>
+        </w:rPr>
+        <w:t xml:space="preserve"> + 回合制可能附带 buff/debuff。</w:t>
+      </w:r>
+    </w:p>
+    <w:p>
+      <w:r>
+        <w:rPr>
+          <w:rFonts w:ascii="Times New Roman" w:hAnsi="Times New Roman" w:eastAsia="宋体"/>
+          <w:b/>
+          <w:i w:val="0"/>
+          <w:sz w:val="21"/>
+        </w:rPr>
+        <w:t>R2 数量关系</w:t>
+      </w:r>
+      <w:r>
+        <w:rPr>
+          <w:rFonts w:ascii="Times New Roman" w:hAnsi="Times New Roman" w:eastAsia="宋体"/>
+          <w:b w:val="0"/>
+          <w:i w:val="0"/>
+          <w:sz w:val="21"/>
+        </w:rPr>
+        <w:t>：实时战斗招式 ≫ 回合制招式数量。</w:t>
+      </w:r>
+      <w:r>
+        <w:rPr>
+          <w:rFonts w:ascii="Times New Roman" w:hAnsi="Times New Roman" w:eastAsia="宋体"/>
+          <w:b/>
+          <w:i w:val="0"/>
+          <w:sz w:val="21"/>
+        </w:rPr>
+        <w:t>回合制 ⊂ 实时战斗</w:t>
+      </w:r>
+      <w:r>
+        <w:rPr>
+          <w:rFonts w:ascii="Times New Roman" w:hAnsi="Times New Roman" w:eastAsia="宋体"/>
+          <w:b w:val="0"/>
+          <w:i w:val="0"/>
+          <w:sz w:val="21"/>
+        </w:rPr>
+        <w:t>（回合制是实时战斗的子集）。</w:t>
+      </w:r>
+    </w:p>
+    <w:p>
+      <w:r>
+        <w:rPr>
+          <w:rFonts w:ascii="Times New Roman" w:hAnsi="Times New Roman" w:eastAsia="宋体"/>
+          <w:b/>
+          <w:i w:val="0"/>
+          <w:sz w:val="21"/>
+        </w:rPr>
+        <w:t>R3 包含关系（三相似）</w:t>
+      </w:r>
+      <w:r>
+        <w:rPr>
+          <w:rFonts w:ascii="Times New Roman" w:hAnsi="Times New Roman" w:eastAsia="宋体"/>
+          <w:b w:val="0"/>
+          <w:i w:val="0"/>
+          <w:sz w:val="21"/>
+        </w:rPr>
+        <w:t>：</w:t>
+      </w:r>
+      <w:r>
+        <w:rPr>
+          <w:rFonts w:ascii="Times New Roman" w:hAnsi="Times New Roman" w:eastAsia="宋体"/>
+          <w:b/>
+          <w:i w:val="0"/>
+          <w:sz w:val="21"/>
+        </w:rPr>
+        <w:t>回合制里出现的每一招，都能在实时战斗里找到</w:t>
+      </w:r>
+      <w:r>
+        <w:rPr>
+          <w:rFonts w:ascii="Times New Roman" w:hAnsi="Times New Roman" w:eastAsia="宋体"/>
+          <w:b w:val="0"/>
+          <w:i w:val="0"/>
+          <w:sz w:val="21"/>
+        </w:rPr>
+        <w:t>对应一招——表现相似 + 定位相似 + 效果相似。</w:t>
+      </w:r>
+    </w:p>
+    <w:p>
+      <w:r>
+        <w:rPr>
+          <w:rFonts w:ascii="Times New Roman" w:hAnsi="Times New Roman" w:eastAsia="宋体"/>
+          <w:b/>
+          <w:i w:val="0"/>
+          <w:sz w:val="21"/>
+        </w:rPr>
+        <w:t>R4 映射规则</w:t>
+      </w:r>
+      <w:r>
+        <w:rPr>
+          <w:rFonts w:ascii="Times New Roman" w:hAnsi="Times New Roman" w:eastAsia="宋体"/>
+          <w:b w:val="0"/>
+          <w:i w:val="0"/>
+          <w:sz w:val="21"/>
+        </w:rPr>
+        <w:t>：</w:t>
+      </w:r>
+      <w:r>
+        <w:rPr>
+          <w:rFonts w:ascii="Times New Roman" w:hAnsi="Times New Roman" w:eastAsia="宋体"/>
+          <w:b/>
+          <w:i w:val="0"/>
+          <w:sz w:val="21"/>
+        </w:rPr>
+        <w:t>普攻也会出现在回合制指令菜单里</w:t>
+      </w:r>
+      <w:r>
+        <w:rPr>
+          <w:rFonts w:ascii="Times New Roman" w:hAnsi="Times New Roman" w:eastAsia="宋体"/>
+          <w:b w:val="0"/>
+          <w:i w:val="0"/>
+          <w:sz w:val="21"/>
+        </w:rPr>
+        <w:t>（不是"普攻不入菜单"）。任意招式——</w:t>
+      </w:r>
+      <w:r>
+        <w:rPr>
+          <w:rFonts w:ascii="Times New Roman" w:hAnsi="Times New Roman" w:eastAsia="宋体"/>
+          <w:b/>
+          <w:i w:val="0"/>
+          <w:sz w:val="21"/>
+        </w:rPr>
+        <w:t>包括终结技</w:t>
+      </w:r>
+      <w:r>
+        <w:rPr>
+          <w:rFonts w:ascii="Times New Roman" w:hAnsi="Times New Roman" w:eastAsia="宋体"/>
+          <w:b w:val="0"/>
+          <w:i w:val="0"/>
+          <w:sz w:val="21"/>
+        </w:rPr>
+        <w:t>——都有可能映射成回合制的战技 / 终结技。终结技、战技这些词在两个模式下都通用——实时战斗</w:t>
+      </w:r>
+      <w:r>
+        <w:rPr>
+          <w:rFonts w:ascii="Times New Roman" w:hAnsi="Times New Roman" w:eastAsia="宋体"/>
+          <w:b/>
+          <w:i w:val="0"/>
+          <w:sz w:val="21"/>
+        </w:rPr>
+        <w:t>也有</w:t>
+      </w:r>
+      <w:r>
+        <w:rPr>
+          <w:rFonts w:ascii="Times New Roman" w:hAnsi="Times New Roman" w:eastAsia="宋体"/>
+          <w:b w:val="0"/>
+          <w:i w:val="0"/>
+          <w:sz w:val="21"/>
+        </w:rPr>
+        <w:t>终结技能量（参考战双）。</w:t>
+      </w:r>
+    </w:p>
+    <w:p>
+      <w:r>
+        <w:rPr>
+          <w:rFonts w:ascii="Times New Roman" w:hAnsi="Times New Roman" w:eastAsia="宋体"/>
+          <w:b/>
+          <w:i w:val="0"/>
+          <w:sz w:val="21"/>
+        </w:rPr>
+        <w:t>R5 Buff/Debuff 规则</w:t>
+      </w:r>
+      <w:r>
+        <w:rPr>
+          <w:rFonts w:ascii="Times New Roman" w:hAnsi="Times New Roman" w:eastAsia="宋体"/>
+          <w:b w:val="0"/>
+          <w:i w:val="0"/>
+          <w:sz w:val="21"/>
+        </w:rPr>
+        <w:t xml:space="preserve">：回合制额外的 buff/debuff </w:t>
+      </w:r>
+      <w:r>
+        <w:rPr>
+          <w:rFonts w:ascii="Times New Roman" w:hAnsi="Times New Roman" w:eastAsia="宋体"/>
+          <w:b/>
+          <w:i w:val="0"/>
+          <w:sz w:val="21"/>
+        </w:rPr>
+        <w:t>由技能自己设计</w:t>
+      </w:r>
+      <w:r>
+        <w:rPr>
+          <w:rFonts w:ascii="Times New Roman" w:hAnsi="Times New Roman" w:eastAsia="宋体"/>
+          <w:b w:val="0"/>
+          <w:i w:val="0"/>
+          <w:sz w:val="21"/>
+        </w:rPr>
+        <w:t>——有的招有、有的招没有。不是统一规则。</w:t>
+      </w:r>
+    </w:p>
+    <w:p>
+      <w:r>
+        <w:rPr>
+          <w:rFonts w:ascii="Times New Roman" w:hAnsi="Times New Roman" w:eastAsia="宋体"/>
+          <w:b/>
+          <w:i w:val="0"/>
+          <w:sz w:val="21"/>
+        </w:rPr>
+        <w:t>R6 美术资源</w:t>
+      </w:r>
+      <w:r>
+        <w:rPr>
+          <w:rFonts w:ascii="Times New Roman" w:hAnsi="Times New Roman" w:eastAsia="宋体"/>
+          <w:b w:val="0"/>
+          <w:i w:val="0"/>
+          <w:sz w:val="21"/>
+        </w:rPr>
+        <w:t>：绝大多数动作 / 特效 / 招式表现</w:t>
+      </w:r>
+      <w:r>
+        <w:rPr>
+          <w:rFonts w:ascii="Times New Roman" w:hAnsi="Times New Roman" w:eastAsia="宋体"/>
+          <w:b/>
+          <w:i w:val="0"/>
+          <w:sz w:val="21"/>
+        </w:rPr>
+        <w:t>美术资源共通</w:t>
+      </w:r>
+      <w:r>
+        <w:rPr>
+          <w:rFonts w:ascii="Times New Roman" w:hAnsi="Times New Roman" w:eastAsia="宋体"/>
+          <w:b w:val="0"/>
+          <w:i w:val="0"/>
+          <w:sz w:val="21"/>
+        </w:rPr>
+        <w:t>，</w:t>
+      </w:r>
+      <w:r>
+        <w:rPr>
+          <w:rFonts w:ascii="Times New Roman" w:hAnsi="Times New Roman" w:eastAsia="宋体"/>
+          <w:b/>
+          <w:i w:val="0"/>
+          <w:sz w:val="21"/>
+        </w:rPr>
+        <w:t>只需要重新处理镜头表现</w:t>
+      </w:r>
+      <w:r>
+        <w:rPr>
+          <w:rFonts w:ascii="Times New Roman" w:hAnsi="Times New Roman" w:eastAsia="宋体"/>
+          <w:b w:val="0"/>
+          <w:i w:val="0"/>
+          <w:sz w:val="21"/>
+        </w:rPr>
+        <w:t>（回合制镜头 vs 即时镜头）。</w:t>
+      </w:r>
+    </w:p>
+    <w:p>
+      <w:r>
+        <w:rPr>
+          <w:rFonts w:ascii="Times New Roman" w:hAnsi="Times New Roman" w:eastAsia="宋体"/>
+          <w:b w:val="0"/>
+          <w:i w:val="0"/>
+          <w:sz w:val="21"/>
+        </w:rPr>
+        <w:t>#### 为什么这样设计</w:t>
+      </w:r>
+    </w:p>
+    <w:p>
+      <w:r>
+        <w:rPr>
+          <w:rFonts w:ascii="Times New Roman" w:hAnsi="Times New Roman" w:eastAsia="宋体"/>
+          <w:b/>
+          <w:i w:val="0"/>
+          <w:sz w:val="21"/>
+        </w:rPr>
+        <w:t>L1</w:t>
+      </w:r>
+      <w:r>
+        <w:rPr>
+          <w:rFonts w:ascii="Times New Roman" w:hAnsi="Times New Roman" w:eastAsia="宋体"/>
+          <w:b w:val="0"/>
+          <w:i w:val="0"/>
+          <w:sz w:val="21"/>
+        </w:rPr>
+        <w:t xml:space="preserve"> 空轨将双模式切换叫"战术切换"——没有用设定 / 世界观包装，因为自己的战术调整不能让敌人也按 AT 条行动。本作用</w:t>
+      </w:r>
+      <w:r>
+        <w:rPr>
+          <w:rFonts w:ascii="Times New Roman" w:hAnsi="Times New Roman" w:eastAsia="宋体"/>
+          <w:b/>
+          <w:i w:val="0"/>
+          <w:sz w:val="21"/>
+        </w:rPr>
+        <w:t>希恩的怀表</w:t>
+      </w:r>
+      <w:r>
+        <w:rPr>
+          <w:rFonts w:ascii="Times New Roman" w:hAnsi="Times New Roman" w:eastAsia="宋体"/>
+          <w:b w:val="0"/>
+          <w:i w:val="0"/>
+          <w:sz w:val="21"/>
+        </w:rPr>
+        <w:t>作为叙事开关——按怀表 = 施加秩序 = 怀表既是剧情道具也是系统开关，按一次希恩失去一段记忆 = 真结局代价。</w:t>
+      </w:r>
+    </w:p>
+    <w:p>
+      <w:r>
+        <w:rPr>
+          <w:rFonts w:ascii="Times New Roman" w:hAnsi="Times New Roman" w:eastAsia="宋体"/>
+          <w:b/>
+          <w:i w:val="0"/>
+          <w:sz w:val="21"/>
+        </w:rPr>
+        <w:t>L2</w:t>
+      </w:r>
+      <w:r>
+        <w:rPr>
+          <w:rFonts w:ascii="Times New Roman" w:hAnsi="Times New Roman" w:eastAsia="宋体"/>
+          <w:b w:val="0"/>
+          <w:i w:val="0"/>
+          <w:sz w:val="21"/>
+        </w:rPr>
+        <w:t xml:space="preserve"> 这条规则解决 4 个玩家体验问题：</w:t>
+      </w:r>
+      <w:r>
+        <w:br/>
+      </w:r>
+      <w:r>
+        <w:rPr>
+          <w:rFonts w:ascii="Times New Roman" w:hAnsi="Times New Roman" w:eastAsia="宋体"/>
+          <w:b w:val="0"/>
+          <w:i w:val="0"/>
+          <w:sz w:val="21"/>
+        </w:rPr>
+        <w:t>1. 玩家在野外看到【猎空斩】→ 进 BOSS 战看到 → 「啊是这招」，叙事连贯</w:t>
+      </w:r>
+      <w:r>
+        <w:br/>
+      </w:r>
+      <w:r>
+        <w:rPr>
+          <w:rFonts w:ascii="Times New Roman" w:hAnsi="Times New Roman" w:eastAsia="宋体"/>
+          <w:b w:val="0"/>
+          <w:i w:val="0"/>
+          <w:sz w:val="21"/>
+        </w:rPr>
+        <w:t>2. 即时练熟的招式在回合制里也能用——</w:t>
+      </w:r>
+      <w:r>
+        <w:rPr>
+          <w:rFonts w:ascii="Times New Roman" w:hAnsi="Times New Roman" w:eastAsia="宋体"/>
+          <w:b/>
+          <w:i w:val="0"/>
+          <w:sz w:val="21"/>
+        </w:rPr>
+        <w:t>肌肉记忆 + 数值进阶</w:t>
+      </w:r>
+      <w:r>
+        <w:rPr>
+          <w:rFonts w:ascii="Times New Roman" w:hAnsi="Times New Roman" w:eastAsia="宋体"/>
+          <w:b w:val="0"/>
+          <w:i w:val="0"/>
+          <w:sz w:val="21"/>
+        </w:rPr>
+        <w:t>，不浪费</w:t>
+      </w:r>
+      <w:r>
+        <w:br/>
+      </w:r>
+      <w:r>
+        <w:rPr>
+          <w:rFonts w:ascii="Times New Roman" w:hAnsi="Times New Roman" w:eastAsia="宋体"/>
+          <w:b w:val="0"/>
+          <w:i w:val="0"/>
+          <w:sz w:val="21"/>
+        </w:rPr>
+        <w:t>3. 角色性格 / 武术风格在两套系统里</w:t>
+      </w:r>
+      <w:r>
+        <w:rPr>
+          <w:rFonts w:ascii="Times New Roman" w:hAnsi="Times New Roman" w:eastAsia="宋体"/>
+          <w:b/>
+          <w:i w:val="0"/>
+          <w:sz w:val="21"/>
+        </w:rPr>
+        <w:t>一致</w:t>
+      </w:r>
+      <w:r>
+        <w:rPr>
+          <w:rFonts w:ascii="Times New Roman" w:hAnsi="Times New Roman" w:eastAsia="宋体"/>
+          <w:b w:val="0"/>
+          <w:i w:val="0"/>
+          <w:sz w:val="21"/>
+        </w:rPr>
+        <w:t>——不存在"两套性格"</w:t>
+      </w:r>
+      <w:r>
+        <w:br/>
+      </w:r>
+      <w:r>
+        <w:rPr>
+          <w:rFonts w:ascii="Times New Roman" w:hAnsi="Times New Roman" w:eastAsia="宋体"/>
+          <w:b w:val="0"/>
+          <w:i w:val="0"/>
+          <w:sz w:val="21"/>
+        </w:rPr>
+        <w:t>4. 双模式不割裂——是同一套招式系统在两种播放形式下的展示</w:t>
+      </w:r>
+    </w:p>
+    <w:p>
+      <w:r>
+        <w:rPr>
+          <w:rFonts w:ascii="Times New Roman" w:hAnsi="Times New Roman" w:eastAsia="宋体"/>
+          <w:b/>
+          <w:i w:val="0"/>
+          <w:sz w:val="21"/>
+        </w:rPr>
+        <w:t>L3</w:t>
+      </w:r>
+      <w:r>
+        <w:rPr>
+          <w:rFonts w:ascii="Times New Roman" w:hAnsi="Times New Roman" w:eastAsia="宋体"/>
+          <w:b w:val="0"/>
+          <w:i w:val="0"/>
+          <w:sz w:val="21"/>
+        </w:rPr>
+        <w:t xml:space="preserve"> 沉浸感 = 「我相信这个世界」。招式的同一性是这个"信"的基础——玩家在两套模式下看到的是同一招式，不会有"为啥野外能放、回合制里换了个名字"的违和感。</w:t>
+      </w:r>
+    </w:p>
+    <w:p>
+      <w:r>
+        <w:rPr>
+          <w:rFonts w:ascii="Times New Roman" w:hAnsi="Times New Roman" w:eastAsia="宋体"/>
+          <w:b/>
+          <w:i w:val="0"/>
+          <w:sz w:val="21"/>
+        </w:rPr>
+        <w:t>L4</w:t>
+      </w:r>
+      <w:r>
+        <w:rPr>
+          <w:rFonts w:ascii="Times New Roman" w:hAnsi="Times New Roman" w:eastAsia="宋体"/>
+          <w:b w:val="0"/>
+          <w:i w:val="0"/>
+          <w:sz w:val="21"/>
+        </w:rPr>
+        <w:t xml:space="preserve"> 这是 JRPG 与 ARPG 的根本区别：ARPG 招式是动作数据，JRPG 招式是</w:t>
+      </w:r>
+      <w:r>
+        <w:rPr>
+          <w:rFonts w:ascii="Times New Roman" w:hAnsi="Times New Roman" w:eastAsia="宋体"/>
+          <w:b/>
+          <w:i w:val="0"/>
+          <w:sz w:val="21"/>
+        </w:rPr>
+        <w:t>角色记忆</w:t>
+      </w:r>
+      <w:r>
+        <w:rPr>
+          <w:rFonts w:ascii="Times New Roman" w:hAnsi="Times New Roman" w:eastAsia="宋体"/>
+          <w:b w:val="0"/>
+          <w:i w:val="0"/>
+          <w:sz w:val="21"/>
+        </w:rPr>
+        <w:t>。</w:t>
+      </w:r>
+      <w:r>
+        <w:rPr>
+          <w:rFonts w:ascii="Times New Roman" w:hAnsi="Times New Roman" w:eastAsia="宋体"/>
+          <w:b/>
+          <w:i w:val="0"/>
+          <w:sz w:val="21"/>
+        </w:rPr>
+        <w:t>同一招</w:t>
+      </w:r>
+      <w:r>
+        <w:rPr>
+          <w:rFonts w:ascii="Times New Roman" w:hAnsi="Times New Roman" w:eastAsia="宋体"/>
+          <w:b w:val="0"/>
+          <w:i w:val="0"/>
+          <w:sz w:val="21"/>
+        </w:rPr>
+        <w:t>就是这个"角色记忆"的载体。</w:t>
+      </w:r>
+    </w:p>
+    <w:p>
+      <w:pPr>
+        <w:pStyle w:val="Heading3"/>
+      </w:pPr>
+      <w:r>
+        <w:rPr>
+          <w:rFonts w:ascii="Times New Roman" w:hAnsi="Times New Roman" w:eastAsia="宋体"/>
+          <w:b w:val="0"/>
+          <w:i w:val="0"/>
+          <w:sz w:val="21"/>
+        </w:rPr>
+        <w:t>3.1.2 数值分离原则（v1.4 新增——核心设计）</w:t>
+      </w:r>
+    </w:p>
+    <w:p>
+      <w:r>
+        <w:rPr>
+          <w:rFonts w:ascii="Times New Roman" w:hAnsi="Times New Roman" w:eastAsia="宋体"/>
+          <w:b/>
+          <w:i w:val="0"/>
+          <w:sz w:val="21"/>
+        </w:rPr>
+        <w:t>同一个招式</w:t>
+      </w:r>
+      <w:r>
+        <w:rPr>
+          <w:rFonts w:ascii="Times New Roman" w:hAnsi="Times New Roman" w:eastAsia="宋体"/>
+          <w:b w:val="0"/>
+          <w:i w:val="0"/>
+          <w:sz w:val="21"/>
+        </w:rPr>
+        <w:t>在即时战斗和回合制里</w:t>
+      </w:r>
+      <w:r>
+        <w:rPr>
+          <w:rFonts w:ascii="Times New Roman" w:hAnsi="Times New Roman" w:eastAsia="宋体"/>
+          <w:b/>
+          <w:i w:val="0"/>
+          <w:sz w:val="21"/>
+        </w:rPr>
+        <w:t>数值计算规则不一样</w:t>
+      </w:r>
+      <w:r>
+        <w:rPr>
+          <w:rFonts w:ascii="Times New Roman" w:hAnsi="Times New Roman" w:eastAsia="宋体"/>
+          <w:b w:val="0"/>
+          <w:i w:val="0"/>
+          <w:sz w:val="21"/>
+        </w:rPr>
+        <w:t>。这是 R1（同一招式）的数值侧支撑——招式同名 / 同动画，但</w:t>
+      </w:r>
+      <w:r>
+        <w:rPr>
+          <w:rFonts w:ascii="Times New Roman" w:hAnsi="Times New Roman" w:eastAsia="宋体"/>
+          <w:b/>
+          <w:i w:val="0"/>
+          <w:sz w:val="21"/>
+        </w:rPr>
+        <w:t>伤害公式不同</w:t>
+      </w:r>
+      <w:r>
+        <w:rPr>
+          <w:rFonts w:ascii="Times New Roman" w:hAnsi="Times New Roman" w:eastAsia="宋体"/>
+          <w:b w:val="0"/>
+          <w:i w:val="0"/>
+          <w:sz w:val="21"/>
+        </w:rPr>
+        <w:t>。</w:t>
+      </w:r>
+    </w:p>
+    <w:tbl>
+      <w:tblPr>
+        <w:tblStyle w:val="LightGrid-Accent1"/>
+        <w:tblW w:type="auto" w:w="0"/>
+        <w:tblLook w:firstColumn="1" w:firstRow="1" w:lastColumn="0" w:lastRow="0" w:noHBand="0" w:noVBand="1" w:val="04A0"/>
+      </w:tblPr>
+      <w:tblGrid>
+        <w:gridCol w:w="2880"/>
+        <w:gridCol w:w="2880"/>
+        <w:gridCol w:w="2880"/>
+      </w:tblGrid>
+      <w:tr>
+        <w:tc>
+          <w:tcPr>
+            <w:tcW w:type="dxa" w:w="2880"/>
+          </w:tcPr>
+          <w:p>
+            <w:r/>
+            <w:r>
+              <w:rPr>
+                <w:rFonts w:ascii="Times New Roman" w:hAnsi="Times New Roman" w:eastAsia="宋体"/>
+                <w:b w:val="0"/>
+                <w:i w:val="0"/>
+                <w:sz w:val="21"/>
+              </w:rPr>
+              <w:t>参数</w:t>
+            </w:r>
+          </w:p>
+        </w:tc>
+        <w:tc>
+          <w:tcPr>
+            <w:tcW w:type="dxa" w:w="2880"/>
+          </w:tcPr>
+          <w:p>
+            <w:r/>
+            <w:r>
+              <w:rPr>
+                <w:rFonts w:ascii="Times New Roman" w:hAnsi="Times New Roman" w:eastAsia="宋体"/>
+                <w:b w:val="0"/>
+                <w:i w:val="0"/>
+                <w:sz w:val="21"/>
+              </w:rPr>
+              <w:t>即时战斗</w:t>
+            </w:r>
+          </w:p>
+        </w:tc>
+        <w:tc>
+          <w:tcPr>
+            <w:tcW w:type="dxa" w:w="2880"/>
+          </w:tcPr>
+          <w:p>
+            <w:r/>
+            <w:r>
+              <w:rPr>
+                <w:rFonts w:ascii="Times New Roman" w:hAnsi="Times New Roman" w:eastAsia="宋体"/>
+                <w:b w:val="0"/>
+                <w:i w:val="0"/>
+                <w:sz w:val="21"/>
+              </w:rPr>
+              <w:t>回合制</w:t>
+            </w:r>
+          </w:p>
+        </w:tc>
+      </w:tr>
+      <w:tr>
+        <w:tc>
+          <w:tcPr>
+            <w:tcW w:type="dxa" w:w="2880"/>
+          </w:tcPr>
+          <w:p>
+            <w:r/>
+            <w:r>
+              <w:rPr>
+                <w:rFonts w:ascii="Times New Roman" w:hAnsi="Times New Roman" w:eastAsia="宋体"/>
+                <w:b w:val="0"/>
+                <w:i w:val="0"/>
+                <w:sz w:val="21"/>
+              </w:rPr>
+              <w:t>双防</w:t>
+            </w:r>
+          </w:p>
+        </w:tc>
+        <w:tc>
+          <w:tcPr>
+            <w:tcW w:type="dxa" w:w="2880"/>
+          </w:tcPr>
+          <w:p>
+            <w:r/>
+            <w:r>
+              <w:rPr>
+                <w:rFonts w:ascii="Times New Roman" w:hAnsi="Times New Roman" w:eastAsia="宋体"/>
+                <w:b w:val="0"/>
+                <w:i w:val="0"/>
+                <w:sz w:val="21"/>
+              </w:rPr>
+              <w:t>✓</w:t>
+            </w:r>
+          </w:p>
+        </w:tc>
+        <w:tc>
+          <w:tcPr>
+            <w:tcW w:type="dxa" w:w="2880"/>
+          </w:tcPr>
+          <w:p>
+            <w:r/>
+            <w:r>
+              <w:rPr>
+                <w:rFonts w:ascii="Times New Roman" w:hAnsi="Times New Roman" w:eastAsia="宋体"/>
+                <w:b w:val="0"/>
+                <w:i w:val="0"/>
+                <w:sz w:val="21"/>
+              </w:rPr>
+              <w:t>✓</w:t>
+            </w:r>
+          </w:p>
+        </w:tc>
+      </w:tr>
+      <w:tr>
+        <w:tc>
+          <w:tcPr>
+            <w:tcW w:type="dxa" w:w="2880"/>
+          </w:tcPr>
+          <w:p>
+            <w:r/>
+            <w:r>
+              <w:rPr>
+                <w:rFonts w:ascii="Times New Roman" w:hAnsi="Times New Roman" w:eastAsia="宋体"/>
+                <w:b w:val="0"/>
+                <w:i w:val="0"/>
+                <w:sz w:val="21"/>
+              </w:rPr>
+              <w:t>双攻</w:t>
+            </w:r>
+          </w:p>
+        </w:tc>
+        <w:tc>
+          <w:tcPr>
+            <w:tcW w:type="dxa" w:w="2880"/>
+          </w:tcPr>
+          <w:p>
+            <w:r/>
+            <w:r>
+              <w:rPr>
+                <w:rFonts w:ascii="Times New Roman" w:hAnsi="Times New Roman" w:eastAsia="宋体"/>
+                <w:b w:val="0"/>
+                <w:i w:val="0"/>
+                <w:sz w:val="21"/>
+              </w:rPr>
+              <w:t>✓</w:t>
+            </w:r>
+          </w:p>
+        </w:tc>
+        <w:tc>
+          <w:tcPr>
+            <w:tcW w:type="dxa" w:w="2880"/>
+          </w:tcPr>
+          <w:p>
+            <w:r/>
+            <w:r>
+              <w:rPr>
+                <w:rFonts w:ascii="Times New Roman" w:hAnsi="Times New Roman" w:eastAsia="宋体"/>
+                <w:b w:val="0"/>
+                <w:i w:val="0"/>
+                <w:sz w:val="21"/>
+              </w:rPr>
+              <w:t>✓</w:t>
+            </w:r>
+          </w:p>
+        </w:tc>
+      </w:tr>
+      <w:tr>
+        <w:tc>
+          <w:tcPr>
+            <w:tcW w:type="dxa" w:w="2880"/>
+          </w:tcPr>
+          <w:p>
+            <w:r/>
+            <w:r>
+              <w:rPr>
+                <w:rFonts w:ascii="Times New Roman" w:hAnsi="Times New Roman" w:eastAsia="宋体"/>
+                <w:b w:val="0"/>
+                <w:i w:val="0"/>
+                <w:sz w:val="21"/>
+              </w:rPr>
+              <w:t>暴击率</w:t>
+            </w:r>
+          </w:p>
+        </w:tc>
+        <w:tc>
+          <w:tcPr>
+            <w:tcW w:type="dxa" w:w="2880"/>
+          </w:tcPr>
+          <w:p>
+            <w:r/>
+            <w:r>
+              <w:rPr>
+                <w:rFonts w:ascii="Times New Roman" w:hAnsi="Times New Roman" w:eastAsia="宋体"/>
+                <w:b w:val="0"/>
+                <w:i w:val="0"/>
+                <w:sz w:val="21"/>
+              </w:rPr>
+              <w:t>✓</w:t>
+            </w:r>
+          </w:p>
+        </w:tc>
+        <w:tc>
+          <w:tcPr>
+            <w:tcW w:type="dxa" w:w="2880"/>
+          </w:tcPr>
+          <w:p>
+            <w:r/>
+            <w:r>
+              <w:rPr>
+                <w:rFonts w:ascii="Times New Roman" w:hAnsi="Times New Roman" w:eastAsia="宋体"/>
+                <w:b w:val="0"/>
+                <w:i w:val="0"/>
+                <w:sz w:val="21"/>
+              </w:rPr>
+              <w:t>✓</w:t>
+            </w:r>
+          </w:p>
+        </w:tc>
+      </w:tr>
+      <w:tr>
+        <w:tc>
+          <w:tcPr>
+            <w:tcW w:type="dxa" w:w="2880"/>
+          </w:tcPr>
+          <w:p>
+            <w:r/>
+            <w:r>
+              <w:rPr>
+                <w:rFonts w:ascii="Times New Roman" w:hAnsi="Times New Roman" w:eastAsia="宋体"/>
+                <w:b w:val="0"/>
+                <w:i w:val="0"/>
+                <w:sz w:val="21"/>
+              </w:rPr>
+              <w:t>暴击伤害</w:t>
+            </w:r>
+          </w:p>
+        </w:tc>
+        <w:tc>
+          <w:tcPr>
+            <w:tcW w:type="dxa" w:w="2880"/>
+          </w:tcPr>
+          <w:p>
+            <w:r/>
+            <w:r>
+              <w:rPr>
+                <w:rFonts w:ascii="Times New Roman" w:hAnsi="Times New Roman" w:eastAsia="宋体"/>
+                <w:b w:val="0"/>
+                <w:i w:val="0"/>
+                <w:sz w:val="21"/>
+              </w:rPr>
+              <w:t>✓</w:t>
+            </w:r>
+          </w:p>
+        </w:tc>
+        <w:tc>
+          <w:tcPr>
+            <w:tcW w:type="dxa" w:w="2880"/>
+          </w:tcPr>
+          <w:p>
+            <w:r/>
+            <w:r>
+              <w:rPr>
+                <w:rFonts w:ascii="Times New Roman" w:hAnsi="Times New Roman" w:eastAsia="宋体"/>
+                <w:b w:val="0"/>
+                <w:i w:val="0"/>
+                <w:sz w:val="21"/>
+              </w:rPr>
+              <w:t>✓</w:t>
+            </w:r>
+          </w:p>
+        </w:tc>
+      </w:tr>
+      <w:tr>
+        <w:tc>
+          <w:tcPr>
+            <w:tcW w:type="dxa" w:w="2880"/>
+          </w:tcPr>
+          <w:p>
+            <w:r/>
+            <w:r>
+              <w:rPr>
+                <w:rFonts w:ascii="Times New Roman" w:hAnsi="Times New Roman" w:eastAsia="宋体"/>
+                <w:b w:val="0"/>
+                <w:i w:val="0"/>
+                <w:sz w:val="21"/>
+              </w:rPr>
+              <w:t>技能威力</w:t>
+            </w:r>
+          </w:p>
+        </w:tc>
+        <w:tc>
+          <w:tcPr>
+            <w:tcW w:type="dxa" w:w="2880"/>
+          </w:tcPr>
+          <w:p>
+            <w:r/>
+            <w:r>
+              <w:rPr>
+                <w:rFonts w:ascii="Times New Roman" w:hAnsi="Times New Roman" w:eastAsia="宋体"/>
+                <w:b w:val="0"/>
+                <w:i w:val="0"/>
+                <w:sz w:val="21"/>
+              </w:rPr>
+              <w:t>—</w:t>
+            </w:r>
+          </w:p>
+        </w:tc>
+        <w:tc>
+          <w:tcPr>
+            <w:tcW w:type="dxa" w:w="2880"/>
+          </w:tcPr>
+          <w:p>
+            <w:r/>
+            <w:r>
+              <w:rPr>
+                <w:rFonts w:ascii="Times New Roman" w:hAnsi="Times New Roman" w:eastAsia="宋体"/>
+                <w:b w:val="0"/>
+                <w:i w:val="0"/>
+                <w:sz w:val="21"/>
+              </w:rPr>
+              <w:t>✓</w:t>
+            </w:r>
+          </w:p>
+        </w:tc>
+      </w:tr>
+      <w:tr>
+        <w:tc>
+          <w:tcPr>
+            <w:tcW w:type="dxa" w:w="2880"/>
+          </w:tcPr>
+          <w:p>
+            <w:r/>
+            <w:r>
+              <w:rPr>
+                <w:rFonts w:ascii="Times New Roman" w:hAnsi="Times New Roman" w:eastAsia="宋体"/>
+                <w:b w:val="0"/>
+                <w:i w:val="0"/>
+                <w:sz w:val="21"/>
+              </w:rPr>
+              <w:t>威力调整系数</w:t>
+            </w:r>
+          </w:p>
+        </w:tc>
+        <w:tc>
+          <w:tcPr>
+            <w:tcW w:type="dxa" w:w="2880"/>
+          </w:tcPr>
+          <w:p>
+            <w:r/>
+            <w:r>
+              <w:rPr>
+                <w:rFonts w:ascii="Times New Roman" w:hAnsi="Times New Roman" w:eastAsia="宋体"/>
+                <w:b w:val="0"/>
+                <w:i w:val="0"/>
+                <w:sz w:val="21"/>
+              </w:rPr>
+              <w:t>—</w:t>
+            </w:r>
+          </w:p>
+        </w:tc>
+        <w:tc>
+          <w:tcPr>
+            <w:tcW w:type="dxa" w:w="2880"/>
+          </w:tcPr>
+          <w:p>
+            <w:r/>
+            <w:r>
+              <w:rPr>
+                <w:rFonts w:ascii="Times New Roman" w:hAnsi="Times New Roman" w:eastAsia="宋体"/>
+                <w:b w:val="0"/>
+                <w:i w:val="0"/>
+                <w:sz w:val="21"/>
+              </w:rPr>
+              <w:t>✓</w:t>
+            </w:r>
+          </w:p>
+        </w:tc>
+      </w:tr>
+      <w:tr>
+        <w:tc>
+          <w:tcPr>
+            <w:tcW w:type="dxa" w:w="2880"/>
+          </w:tcPr>
+          <w:p>
+            <w:r/>
+            <w:r>
+              <w:rPr>
+                <w:rFonts w:ascii="Times New Roman" w:hAnsi="Times New Roman" w:eastAsia="宋体"/>
+                <w:b w:val="0"/>
+                <w:i w:val="0"/>
+                <w:sz w:val="21"/>
+              </w:rPr>
+              <w:t>属性等级</w:t>
+            </w:r>
+          </w:p>
+        </w:tc>
+        <w:tc>
+          <w:tcPr>
+            <w:tcW w:type="dxa" w:w="2880"/>
+          </w:tcPr>
+          <w:p>
+            <w:r/>
+            <w:r>
+              <w:rPr>
+                <w:rFonts w:ascii="Times New Roman" w:hAnsi="Times New Roman" w:eastAsia="宋体"/>
+                <w:b w:val="0"/>
+                <w:i w:val="0"/>
+                <w:sz w:val="21"/>
+              </w:rPr>
+              <w:t>—</w:t>
+            </w:r>
+          </w:p>
+        </w:tc>
+        <w:tc>
+          <w:tcPr>
+            <w:tcW w:type="dxa" w:w="2880"/>
+          </w:tcPr>
+          <w:p>
+            <w:r/>
+            <w:r>
+              <w:rPr>
+                <w:rFonts w:ascii="Times New Roman" w:hAnsi="Times New Roman" w:eastAsia="宋体"/>
+                <w:b w:val="0"/>
+                <w:i w:val="0"/>
+                <w:sz w:val="21"/>
+              </w:rPr>
+              <w:t>✓</w:t>
+            </w:r>
+          </w:p>
+        </w:tc>
+      </w:tr>
+      <w:tr>
+        <w:tc>
+          <w:tcPr>
+            <w:tcW w:type="dxa" w:w="2880"/>
+          </w:tcPr>
+          <w:p>
+            <w:r/>
+            <w:r>
+              <w:rPr>
+                <w:rFonts w:ascii="Times New Roman" w:hAnsi="Times New Roman" w:eastAsia="宋体"/>
+                <w:b w:val="0"/>
+                <w:i w:val="0"/>
+                <w:sz w:val="21"/>
+              </w:rPr>
+              <w:t>双攻穿透</w:t>
+            </w:r>
+          </w:p>
+        </w:tc>
+        <w:tc>
+          <w:tcPr>
+            <w:tcW w:type="dxa" w:w="2880"/>
+          </w:tcPr>
+          <w:p>
+            <w:r/>
+            <w:r>
+              <w:rPr>
+                <w:rFonts w:ascii="Times New Roman" w:hAnsi="Times New Roman" w:eastAsia="宋体"/>
+                <w:b w:val="0"/>
+                <w:i w:val="0"/>
+                <w:sz w:val="21"/>
+              </w:rPr>
+              <w:t>—</w:t>
+            </w:r>
+          </w:p>
+        </w:tc>
+        <w:tc>
+          <w:tcPr>
+            <w:tcW w:type="dxa" w:w="2880"/>
+          </w:tcPr>
+          <w:p>
+            <w:r/>
+            <w:r>
+              <w:rPr>
+                <w:rFonts w:ascii="Times New Roman" w:hAnsi="Times New Roman" w:eastAsia="宋体"/>
+                <w:b w:val="0"/>
+                <w:i w:val="0"/>
+                <w:sz w:val="21"/>
+              </w:rPr>
+              <w:t>✓</w:t>
+            </w:r>
+          </w:p>
+        </w:tc>
+      </w:tr>
+      <w:tr>
+        <w:tc>
+          <w:tcPr>
+            <w:tcW w:type="dxa" w:w="2880"/>
+          </w:tcPr>
+          <w:p>
+            <w:r/>
+            <w:r>
+              <w:rPr>
+                <w:rFonts w:ascii="Times New Roman" w:hAnsi="Times New Roman" w:eastAsia="宋体"/>
+                <w:b w:val="0"/>
+                <w:i w:val="0"/>
+                <w:sz w:val="21"/>
+              </w:rPr>
+              <w:t>双防抵抗</w:t>
+            </w:r>
+          </w:p>
+        </w:tc>
+        <w:tc>
+          <w:tcPr>
+            <w:tcW w:type="dxa" w:w="2880"/>
+          </w:tcPr>
+          <w:p>
+            <w:r/>
+            <w:r>
+              <w:rPr>
+                <w:rFonts w:ascii="Times New Roman" w:hAnsi="Times New Roman" w:eastAsia="宋体"/>
+                <w:b w:val="0"/>
+                <w:i w:val="0"/>
+                <w:sz w:val="21"/>
+              </w:rPr>
+              <w:t>—</w:t>
+            </w:r>
+          </w:p>
+        </w:tc>
+        <w:tc>
+          <w:tcPr>
+            <w:tcW w:type="dxa" w:w="2880"/>
+          </w:tcPr>
+          <w:p>
+            <w:r/>
+            <w:r>
+              <w:rPr>
+                <w:rFonts w:ascii="Times New Roman" w:hAnsi="Times New Roman" w:eastAsia="宋体"/>
+                <w:b w:val="0"/>
+                <w:i w:val="0"/>
+                <w:sz w:val="21"/>
+              </w:rPr>
+              <w:t>✓</w:t>
+            </w:r>
+          </w:p>
+        </w:tc>
+      </w:tr>
+      <w:tr>
+        <w:tc>
+          <w:tcPr>
+            <w:tcW w:type="dxa" w:w="2880"/>
+          </w:tcPr>
+          <w:p>
+            <w:r/>
+            <w:r>
+              <w:rPr>
+                <w:rFonts w:ascii="Times New Roman" w:hAnsi="Times New Roman" w:eastAsia="宋体"/>
+                <w:b w:val="0"/>
+                <w:i w:val="0"/>
+                <w:sz w:val="21"/>
+              </w:rPr>
+              <w:t>伤害能力</w:t>
+            </w:r>
+          </w:p>
+        </w:tc>
+        <w:tc>
+          <w:tcPr>
+            <w:tcW w:type="dxa" w:w="2880"/>
+          </w:tcPr>
+          <w:p>
+            <w:r/>
+            <w:r>
+              <w:rPr>
+                <w:rFonts w:ascii="Times New Roman" w:hAnsi="Times New Roman" w:eastAsia="宋体"/>
+                <w:b w:val="0"/>
+                <w:i w:val="0"/>
+                <w:sz w:val="21"/>
+              </w:rPr>
+              <w:t>—</w:t>
+            </w:r>
+          </w:p>
+        </w:tc>
+        <w:tc>
+          <w:tcPr>
+            <w:tcW w:type="dxa" w:w="2880"/>
+          </w:tcPr>
+          <w:p>
+            <w:r/>
+            <w:r>
+              <w:rPr>
+                <w:rFonts w:ascii="Times New Roman" w:hAnsi="Times New Roman" w:eastAsia="宋体"/>
+                <w:b w:val="0"/>
+                <w:i w:val="0"/>
+                <w:sz w:val="21"/>
+              </w:rPr>
+              <w:t>✓</w:t>
+            </w:r>
+          </w:p>
+        </w:tc>
+      </w:tr>
+      <w:tr>
+        <w:tc>
+          <w:tcPr>
+            <w:tcW w:type="dxa" w:w="2880"/>
+          </w:tcPr>
+          <w:p>
+            <w:r/>
+            <w:r>
+              <w:rPr>
+                <w:rFonts w:ascii="Times New Roman" w:hAnsi="Times New Roman" w:eastAsia="宋体"/>
+                <w:b w:val="0"/>
+                <w:i w:val="0"/>
+                <w:sz w:val="21"/>
+              </w:rPr>
+              <w:t>伤害抗性</w:t>
+            </w:r>
+          </w:p>
+        </w:tc>
+        <w:tc>
+          <w:tcPr>
+            <w:tcW w:type="dxa" w:w="2880"/>
+          </w:tcPr>
+          <w:p>
+            <w:r/>
+            <w:r>
+              <w:rPr>
+                <w:rFonts w:ascii="Times New Roman" w:hAnsi="Times New Roman" w:eastAsia="宋体"/>
+                <w:b w:val="0"/>
+                <w:i w:val="0"/>
+                <w:sz w:val="21"/>
+              </w:rPr>
+              <w:t>—</w:t>
+            </w:r>
+          </w:p>
+        </w:tc>
+        <w:tc>
+          <w:tcPr>
+            <w:tcW w:type="dxa" w:w="2880"/>
+          </w:tcPr>
+          <w:p>
+            <w:r/>
+            <w:r>
+              <w:rPr>
+                <w:rFonts w:ascii="Times New Roman" w:hAnsi="Times New Roman" w:eastAsia="宋体"/>
+                <w:b w:val="0"/>
+                <w:i w:val="0"/>
+                <w:sz w:val="21"/>
+              </w:rPr>
+              <w:t>✓</w:t>
+            </w:r>
+          </w:p>
+        </w:tc>
+      </w:tr>
+    </w:tbl>
+    <w:p/>
+    <w:p>
+      <w:r>
+        <w:rPr>
+          <w:rFonts w:ascii="Times New Roman" w:hAnsi="Times New Roman" w:eastAsia="宋体"/>
+          <w:b/>
+          <w:i w:val="0"/>
+          <w:sz w:val="21"/>
+        </w:rPr>
+        <w:t>数值标准（v1.4）</w:t>
+      </w:r>
+      <w:r>
+        <w:rPr>
+          <w:rFonts w:ascii="Times New Roman" w:hAnsi="Times New Roman" w:eastAsia="宋体"/>
+          <w:b w:val="0"/>
+          <w:i w:val="0"/>
+          <w:sz w:val="21"/>
+        </w:rPr>
+        <w:t>：哪怕回合制很拖，击杀高血量 BOSS 也一定快过实时战斗——</w:t>
+      </w:r>
+      <w:r>
+        <w:rPr>
+          <w:rFonts w:ascii="Times New Roman" w:hAnsi="Times New Roman" w:eastAsia="宋体"/>
+          <w:b/>
+          <w:i w:val="0"/>
+          <w:sz w:val="21"/>
+        </w:rPr>
+        <w:t>起码快 20%</w:t>
+      </w:r>
+      <w:r>
+        <w:rPr>
+          <w:rFonts w:ascii="Times New Roman" w:hAnsi="Times New Roman" w:eastAsia="宋体"/>
+          <w:b w:val="0"/>
+          <w:i w:val="0"/>
+          <w:sz w:val="21"/>
+        </w:rPr>
+        <w:t>。</w:t>
+      </w:r>
+    </w:p>
+    <w:p>
+      <w:r>
+        <w:rPr>
+          <w:rFonts w:ascii="Times New Roman" w:hAnsi="Times New Roman" w:eastAsia="宋体"/>
+          <w:b w:val="0"/>
+          <w:i w:val="0"/>
+          <w:sz w:val="21"/>
+        </w:rPr>
+        <w:t>#### 为什么这样设计</w:t>
+      </w:r>
+    </w:p>
+    <w:p>
+      <w:r>
+        <w:rPr>
+          <w:rFonts w:ascii="Times New Roman" w:hAnsi="Times New Roman" w:eastAsia="宋体"/>
+          <w:b/>
+          <w:i w:val="0"/>
+          <w:sz w:val="21"/>
+        </w:rPr>
+        <w:t>L1</w:t>
+      </w:r>
+      <w:r>
+        <w:rPr>
+          <w:rFonts w:ascii="Times New Roman" w:hAnsi="Times New Roman" w:eastAsia="宋体"/>
+          <w:b w:val="0"/>
+          <w:i w:val="0"/>
+          <w:sz w:val="21"/>
+        </w:rPr>
+        <w:t xml:space="preserve"> 回合制有更多参数参与（技能威力 / 穿透 / 抵抗 / 属性等级 / 伤害能力 / 抗性）→ 玩家可以</w:t>
+      </w:r>
+      <w:r>
+        <w:rPr>
+          <w:rFonts w:ascii="Times New Roman" w:hAnsi="Times New Roman" w:eastAsia="宋体"/>
+          <w:b/>
+          <w:i w:val="0"/>
+          <w:sz w:val="21"/>
+        </w:rPr>
+        <w:t>通过策略和 build 把伤害堆上去</w:t>
+      </w:r>
+      <w:r>
+        <w:rPr>
+          <w:rFonts w:ascii="Times New Roman" w:hAnsi="Times New Roman" w:eastAsia="宋体"/>
+          <w:b w:val="0"/>
+          <w:i w:val="0"/>
+          <w:sz w:val="21"/>
+        </w:rPr>
+        <w:t>。即时战斗没有这些 → 伤害上限低。</w:t>
+      </w:r>
+    </w:p>
+    <w:p>
+      <w:r>
+        <w:rPr>
+          <w:rFonts w:ascii="Times New Roman" w:hAnsi="Times New Roman" w:eastAsia="宋体"/>
+          <w:b/>
+          <w:i w:val="0"/>
+          <w:sz w:val="21"/>
+        </w:rPr>
+        <w:t>L2</w:t>
+      </w:r>
+      <w:r>
+        <w:rPr>
+          <w:rFonts w:ascii="Times New Roman" w:hAnsi="Times New Roman" w:eastAsia="宋体"/>
+          <w:b w:val="0"/>
+          <w:i w:val="0"/>
+          <w:sz w:val="21"/>
+        </w:rPr>
+        <w:t xml:space="preserve"> 这条规则解决「回合制拖沓但有没有意义」的问题——回合制</w:t>
+      </w:r>
+      <w:r>
+        <w:rPr>
+          <w:rFonts w:ascii="Times New Roman" w:hAnsi="Times New Roman" w:eastAsia="宋体"/>
+          <w:b/>
+          <w:i w:val="0"/>
+          <w:sz w:val="21"/>
+        </w:rPr>
+        <w:t>值得选</w:t>
+      </w:r>
+      <w:r>
+        <w:rPr>
+          <w:rFonts w:ascii="Times New Roman" w:hAnsi="Times New Roman" w:eastAsia="宋体"/>
+          <w:b w:val="0"/>
+          <w:i w:val="0"/>
+          <w:sz w:val="21"/>
+        </w:rPr>
+        <w:t>，因为它数值上更狠。Boss 战强制回合制不是惩罚，是奖励。</w:t>
+      </w:r>
+    </w:p>
+    <w:p>
+      <w:r>
+        <w:rPr>
+          <w:rFonts w:ascii="Times New Roman" w:hAnsi="Times New Roman" w:eastAsia="宋体"/>
+          <w:b/>
+          <w:i w:val="0"/>
+          <w:sz w:val="21"/>
+        </w:rPr>
+        <w:t>L3</w:t>
+      </w:r>
+      <w:r>
+        <w:rPr>
+          <w:rFonts w:ascii="Times New Roman" w:hAnsi="Times New Roman" w:eastAsia="宋体"/>
+          <w:b w:val="0"/>
+          <w:i w:val="0"/>
+          <w:sz w:val="21"/>
+        </w:rPr>
+        <w:t xml:space="preserve"> 玩家成就感来源：「我选回合制是因为它对 Boss 更狠，不是因为剧情强制」——这是</w:t>
+      </w:r>
+      <w:r>
+        <w:rPr>
+          <w:rFonts w:ascii="Times New Roman" w:hAnsi="Times New Roman" w:eastAsia="宋体"/>
+          <w:b/>
+          <w:i w:val="0"/>
+          <w:sz w:val="21"/>
+        </w:rPr>
+        <w:t>主动选择</w:t>
+      </w:r>
+      <w:r>
+        <w:rPr>
+          <w:rFonts w:ascii="Times New Roman" w:hAnsi="Times New Roman" w:eastAsia="宋体"/>
+          <w:b w:val="0"/>
+          <w:i w:val="0"/>
+          <w:sz w:val="21"/>
+        </w:rPr>
+        <w:t>，不是被迫。</w:t>
+      </w:r>
+    </w:p>
+    <w:p>
+      <w:r>
+        <w:rPr>
+          <w:rFonts w:ascii="Times New Roman" w:hAnsi="Times New Roman" w:eastAsia="宋体"/>
+          <w:b/>
+          <w:i w:val="0"/>
+          <w:sz w:val="21"/>
+        </w:rPr>
+        <w:t>L4</w:t>
+      </w:r>
+      <w:r>
+        <w:rPr>
+          <w:rFonts w:ascii="Times New Roman" w:hAnsi="Times New Roman" w:eastAsia="宋体"/>
+          <w:b w:val="0"/>
+          <w:i w:val="0"/>
+          <w:sz w:val="21"/>
+        </w:rPr>
+        <w:t xml:space="preserve"> 这是 JRPG 经典的「策略 &gt; 手速」原则：回合制把更多变量纳入计算（玩家可学习、可计算、可优化），即时战斗只算双攻双防暴击（玩家只能堆面板）。JRPG 的策略深度 = 回合制的存在意义。</w:t>
+      </w:r>
+    </w:p>
+    <w:p>
+      <w:pPr>
+        <w:pStyle w:val="Heading3"/>
+      </w:pPr>
+      <w:r>
+        <w:rPr>
+          <w:rFonts w:ascii="Times New Roman" w:hAnsi="Times New Roman" w:eastAsia="宋体"/>
+          <w:b w:val="0"/>
+          <w:i w:val="0"/>
+          <w:sz w:val="21"/>
+        </w:rPr>
         <w:t>3.2 M2 即时战斗（野外）—— v1.3 操作框架</w:t>
       </w:r>
     </w:p>
@@ -6149,6 +8323,20 @@
       </w:tr>
     </w:tbl>
     <w:p/>
+    <w:p>
+      <w:pPr>
+        <w:ind w:left="340" w:right="227"/>
+      </w:pPr>
+      <w:r>
+        <w:rPr>
+          <w:rFonts w:ascii="Times New Roman" w:hAnsi="Times New Roman" w:eastAsia="宋体"/>
+          <w:i/>
+          <w:sz w:val="21"/>
+        </w:rPr>
+        <w:t>**v1.4 备注**：以上指令中的「普攻 / 战技 / 终结技」——**与 §3.2 M2 即时战斗下的招式是同一招**。详见 §3.1.1 双战斗招式同一性原则。回合制里的普攻 / 战技 / 终结技 → 在即时战斗里都有对应招式（同名、同动画）。指令菜单本身不是独立招式系统——是即时战斗招式库的子集（带回合制额外的 buff/debuff 触发，详见 §3.1.1 R5）。</w:t>
+        <w:br/>
+      </w:r>
+    </w:p>
     <w:p>
       <w:r>
         <w:rPr>
@@ -10438,11 +12626,38 @@
             <w:r>
               <w:rPr>
                 <w:rFonts w:ascii="Times New Roman" w:hAnsi="Times New Roman" w:eastAsia="宋体"/>
-                <w:b w:val="0"/>
-                <w:i w:val="0"/>
-                <w:sz w:val="21"/>
-              </w:rPr>
-              <w:t>即时（攻击 / 闪避 / 受击）+ 回合制（待机 / 施法 / 终结技）</w:t>
+                <w:b/>
+                <w:i w:val="0"/>
+                <w:sz w:val="21"/>
+              </w:rPr>
+              <w:t>共用一套动作 + 特效</w:t>
+            </w:r>
+            <w:r>
+              <w:rPr>
+                <w:rFonts w:ascii="Times New Roman" w:hAnsi="Times New Roman" w:eastAsia="宋体"/>
+                <w:b w:val="0"/>
+                <w:i w:val="0"/>
+                <w:sz w:val="21"/>
+              </w:rPr>
+              <w:t>——即时（攻击 / 闪避 / 受击）+ 回合制（待机 / 施法 / 终结技）。区别只在</w:t>
+            </w:r>
+            <w:r>
+              <w:rPr>
+                <w:rFonts w:ascii="Times New Roman" w:hAnsi="Times New Roman" w:eastAsia="宋体"/>
+                <w:b/>
+                <w:i w:val="0"/>
+                <w:sz w:val="21"/>
+              </w:rPr>
+              <w:t>镜头表现</w:t>
+            </w:r>
+            <w:r>
+              <w:rPr>
+                <w:rFonts w:ascii="Times New Roman" w:hAnsi="Times New Roman" w:eastAsia="宋体"/>
+                <w:b w:val="0"/>
+                <w:i w:val="0"/>
+                <w:sz w:val="21"/>
+              </w:rPr>
+              <w:t>（详见 §3.1.1 R6）</w:t>
             </w:r>
           </w:p>
         </w:tc>

</xml_diff>